<commit_message>
Hiago Vaz Rebelo: procuração e declaração em Lora Medium e Lora Bold
Co-Authored-By: Claude Opus 5.5 <noreply@anthropic.com>
Claude-Session: https://claude.ai/code/session_012ZunBgPCbZwvequ2BZR7ZC
</commit_message>
<xml_diff>
--- a/Hiago Vaz Rebelo - Pix por erro/Procuração e declaração de hipossuficiência - Hiago Vaz Rebelo.docx
+++ b/Hiago Vaz Rebelo - Pix por erro/Procuração e declaração de hipossuficiência - Hiago Vaz Rebelo.docx
@@ -10,6 +10,7 @@
       </w:pPr>
       <w:r>
         <w:rPr>
+          <w:rFonts w:ascii="Lora" w:hAnsi="Lora" w:cs="Lora"/>
           <w:b/>
           <w:bCs/>
           <w:color w:val="123BB8"/>
@@ -59,7 +60,7 @@
             </w:pPr>
             <w:r>
               <w:rPr>
-                <w:rFonts w:ascii="Cambria" w:hAnsi="Cambria" w:cs="Cambria"/>
+                <w:rFonts w:ascii="Lora" w:hAnsi="Lora" w:cs="Lora"/>
                 <w:b/>
                 <w:bCs/>
                 <w:i/>
@@ -89,6 +90,7 @@
             </w:pPr>
             <w:r>
               <w:rPr>
+                <w:rFonts w:ascii="Lora" w:hAnsi="Lora" w:cs="Lora"/>
                 <w:b/>
                 <w:bCs/>
                 <w:sz w:val="22"/>
@@ -98,6 +100,7 @@
             </w:r>
             <w:r>
               <w:rPr>
+                <w:rFonts w:ascii="Lora Medium" w:hAnsi="Lora Medium" w:cs="Lora Medium"/>
                 <w:sz w:val="22"/>
                 <w:szCs w:val="22"/>
               </w:rPr>
@@ -155,7 +158,7 @@
             </w:pPr>
             <w:r>
               <w:rPr>
-                <w:rFonts w:ascii="Cambria" w:hAnsi="Cambria" w:cs="Cambria"/>
+                <w:rFonts w:ascii="Lora" w:hAnsi="Lora" w:cs="Lora"/>
                 <w:b/>
                 <w:bCs/>
                 <w:i/>
@@ -185,6 +188,7 @@
             </w:pPr>
             <w:r>
               <w:rPr>
+                <w:rFonts w:ascii="Lora" w:hAnsi="Lora" w:cs="Lora"/>
                 <w:b/>
                 <w:bCs/>
                 <w:color w:val="123BB8"/>
@@ -195,6 +199,7 @@
             </w:r>
             <w:r>
               <w:rPr>
+                <w:rFonts w:ascii="Lora Medium" w:hAnsi="Lora Medium" w:cs="Lora Medium"/>
                 <w:sz w:val="20"/>
                 <w:szCs w:val="20"/>
               </w:rPr>
@@ -202,6 +207,7 @@
             </w:r>
             <w:r>
               <w:rPr>
+                <w:rFonts w:ascii="Lora Medium" w:hAnsi="Lora Medium" w:cs="Lora Medium"/>
                 <w:i/>
                 <w:iCs/>
                 <w:color w:val="1155CC"/>
@@ -213,6 +219,7 @@
             </w:r>
             <w:r>
               <w:rPr>
+                <w:rFonts w:ascii="Lora Medium" w:hAnsi="Lora Medium" w:cs="Lora Medium"/>
                 <w:sz w:val="20"/>
                 <w:szCs w:val="20"/>
               </w:rPr>
@@ -270,7 +277,7 @@
             </w:pPr>
             <w:r>
               <w:rPr>
-                <w:rFonts w:ascii="Cambria" w:hAnsi="Cambria" w:cs="Cambria"/>
+                <w:rFonts w:ascii="Lora" w:hAnsi="Lora" w:cs="Lora"/>
                 <w:b/>
                 <w:bCs/>
                 <w:i/>
@@ -300,6 +307,7 @@
             </w:pPr>
             <w:r>
               <w:rPr>
+                <w:rFonts w:ascii="Lora Medium" w:hAnsi="Lora Medium" w:cs="Lora Medium"/>
                 <w:sz w:val="20"/>
                 <w:szCs w:val="20"/>
               </w:rPr>
@@ -307,6 +315,7 @@
             </w:r>
             <w:r>
               <w:rPr>
+                <w:rFonts w:ascii="Lora" w:hAnsi="Lora" w:cs="Lora"/>
                 <w:b/>
                 <w:bCs/>
                 <w:sz w:val="20"/>
@@ -316,6 +325,7 @@
             </w:r>
             <w:r>
               <w:rPr>
+                <w:rFonts w:ascii="Lora Medium" w:hAnsi="Lora Medium" w:cs="Lora Medium"/>
                 <w:sz w:val="20"/>
                 <w:szCs w:val="20"/>
               </w:rPr>
@@ -333,6 +343,7 @@
       </w:pPr>
       <w:r>
         <w:rPr>
+          <w:rFonts w:ascii="Lora" w:hAnsi="Lora" w:cs="Lora"/>
           <w:b/>
           <w:bCs/>
           <w:sz w:val="20"/>
@@ -349,6 +360,7 @@
       </w:pPr>
       <w:r>
         <w:rPr>
+          <w:rFonts w:ascii="Lora Medium" w:hAnsi="Lora Medium" w:cs="Lora Medium"/>
           <w:sz w:val="22"/>
           <w:szCs w:val="22"/>
         </w:rPr>
@@ -363,6 +375,7 @@
       </w:pPr>
       <w:r>
         <w:rPr>
+          <w:rFonts w:ascii="Lora Medium" w:hAnsi="Lora Medium" w:cs="Lora Medium"/>
           <w:sz w:val="22"/>
           <w:szCs w:val="22"/>
         </w:rPr>
@@ -377,6 +390,7 @@
       </w:pPr>
       <w:r>
         <w:rPr>
+          <w:rFonts w:ascii="Lora Medium" w:hAnsi="Lora Medium" w:cs="Lora Medium"/>
           <w:sz w:val="22"/>
           <w:szCs w:val="22"/>
         </w:rPr>
@@ -385,12 +399,15 @@
     </w:p>
     <w:p>
       <w:pPr>
+        <w:tabs>
+          <w:tab w:val="left" w:pos="8650"/>
+        </w:tabs>
         <w:spacing w:before="0" w:after="0" w:line="240" w:lineRule="auto"/>
         <w:ind w:left="1050"/>
       </w:pPr>
       <w:r>
         <w:rPr>
-          <w:rFonts w:ascii="Arial" w:hAnsi="Arial" w:cs="Arial"/>
+          <w:rFonts w:ascii="Lora" w:hAnsi="Lora" w:cs="Lora"/>
           <w:b/>
           <w:bCs/>
           <w:sz w:val="22"/>
@@ -400,13 +417,12 @@
       </w:r>
       <w:r>
         <w:rPr>
-          <w:rFonts w:ascii="Arial" w:hAnsi="Arial" w:cs="Arial"/>
+          <w:rFonts w:ascii="Lora" w:hAnsi="Lora"/>
           <w:b/>
-          <w:bCs/>
-          <w:sz w:val="18"/>
-          <w:szCs w:val="18"/>
-        </w:rPr>
-        <w:t xml:space="preserve">__________________________________________________________________________</w:t>
+          <w:sz w:val="22"/>
+          <w:u w:val="single"/>
+        </w:rPr>
+        <w:tab/>
       </w:r>
     </w:p>
     <w:p>
@@ -422,6 +438,7 @@
       </w:pPr>
       <w:r>
         <w:rPr>
+          <w:rFonts w:ascii="Lora Medium" w:hAnsi="Lora Medium" w:cs="Lora Medium"/>
           <w:sz w:val="26"/>
           <w:szCs w:val="26"/>
         </w:rPr>
@@ -436,6 +453,7 @@
       </w:pPr>
       <w:r>
         <w:rPr>
+          <w:rFonts w:ascii="Lora Medium" w:hAnsi="Lora Medium" w:cs="Lora Medium"/>
           <w:sz w:val="26"/>
           <w:szCs w:val="26"/>
         </w:rPr>
@@ -450,6 +468,7 @@
       </w:pPr>
       <w:r>
         <w:rPr>
+          <w:rFonts w:ascii="Lora Medium" w:hAnsi="Lora Medium" w:cs="Lora Medium"/>
           <w:sz w:val="26"/>
           <w:szCs w:val="26"/>
         </w:rPr>
@@ -467,6 +486,7 @@
       </w:pPr>
       <w:r>
         <w:rPr>
+          <w:rFonts w:ascii="Lora" w:hAnsi="Lora" w:cs="Lora"/>
           <w:b/>
           <w:bCs/>
           <w:color w:val="123BB8"/>
@@ -484,6 +504,7 @@
       </w:pPr>
       <w:r>
         <w:rPr>
+          <w:rFonts w:ascii="Lora Medium" w:hAnsi="Lora Medium" w:cs="Lora Medium"/>
           <w:sz w:val="26"/>
           <w:szCs w:val="26"/>
         </w:rPr>
@@ -498,6 +519,7 @@
       </w:pPr>
       <w:r>
         <w:rPr>
+          <w:rFonts w:ascii="Lora Medium" w:hAnsi="Lora Medium" w:cs="Lora Medium"/>
           <w:sz w:val="26"/>
           <w:szCs w:val="26"/>
         </w:rPr>
@@ -512,6 +534,7 @@
       </w:pPr>
       <w:r>
         <w:rPr>
+          <w:rFonts w:ascii="Lora Medium" w:hAnsi="Lora Medium" w:cs="Lora Medium"/>
           <w:sz w:val="26"/>
           <w:szCs w:val="26"/>
         </w:rPr>
@@ -556,6 +579,7 @@
             </w:pPr>
             <w:r>
               <w:rPr>
+                <w:rFonts w:ascii="Lora Medium" w:hAnsi="Lora Medium" w:cs="Lora Medium"/>
                 <w:sz w:val="24"/>
                 <w:szCs w:val="24"/>
               </w:rPr>
@@ -563,6 +587,7 @@
             </w:r>
             <w:r>
               <w:rPr>
+                <w:rFonts w:ascii="Lora" w:hAnsi="Lora" w:cs="Lora"/>
                 <w:b/>
                 <w:bCs/>
                 <w:sz w:val="22"/>
@@ -572,6 +597,7 @@
             </w:r>
             <w:r>
               <w:rPr>
+                <w:rFonts w:ascii="Lora Medium" w:hAnsi="Lora Medium" w:cs="Lora Medium"/>
                 <w:sz w:val="22"/>
                 <w:szCs w:val="22"/>
               </w:rPr>
@@ -579,6 +605,7 @@
             </w:r>
             <w:r>
               <w:rPr>
+                <w:rFonts w:ascii="Lora Medium" w:hAnsi="Lora Medium" w:cs="Lora Medium"/>
                 <w:sz w:val="24"/>
                 <w:szCs w:val="24"/>
               </w:rPr>
@@ -586,6 +613,7 @@
             </w:r>
             <w:r>
               <w:rPr>
+                <w:rFonts w:ascii="Lora" w:hAnsi="Lora" w:cs="Lora"/>
                 <w:b/>
                 <w:bCs/>
                 <w:color w:val="123BB8"/>
@@ -597,6 +625,7 @@
             </w:r>
             <w:r>
               <w:rPr>
+                <w:rFonts w:ascii="Lora Medium" w:hAnsi="Lora Medium" w:cs="Lora Medium"/>
                 <w:sz w:val="24"/>
                 <w:szCs w:val="24"/>
               </w:rPr>
@@ -604,6 +633,7 @@
             </w:r>
             <w:r>
               <w:rPr>
+                <w:rFonts w:ascii="Lora" w:hAnsi="Lora" w:cs="Lora"/>
                 <w:b/>
                 <w:bCs/>
                 <w:color w:val="123BB8"/>
@@ -614,6 +644,7 @@
             </w:r>
             <w:r>
               <w:rPr>
+                <w:rFonts w:ascii="Lora Medium" w:hAnsi="Lora Medium" w:cs="Lora Medium"/>
                 <w:sz w:val="24"/>
                 <w:szCs w:val="24"/>
               </w:rPr>
@@ -628,6 +659,7 @@
             </w:pPr>
             <w:r>
               <w:rPr>
+                <w:rFonts w:ascii="Lora Medium" w:hAnsi="Lora Medium" w:cs="Lora Medium"/>
                 <w:sz w:val="24"/>
                 <w:szCs w:val="24"/>
               </w:rPr>
@@ -645,6 +677,7 @@
       </w:pPr>
       <w:r>
         <w:rPr>
+          <w:rFonts w:ascii="Lora Medium" w:hAnsi="Lora Medium" w:cs="Lora Medium"/>
           <w:sz w:val="22"/>
           <w:szCs w:val="22"/>
         </w:rPr>
@@ -659,6 +692,7 @@
       </w:pPr>
       <w:r>
         <w:rPr>
+          <w:rFonts w:ascii="Lora Medium" w:hAnsi="Lora Medium" w:cs="Lora Medium"/>
           <w:sz w:val="22"/>
           <w:szCs w:val="22"/>
         </w:rPr>
@@ -673,6 +707,7 @@
       </w:pPr>
       <w:r>
         <w:rPr>
+          <w:rFonts w:ascii="Lora" w:hAnsi="Lora" w:cs="Lora"/>
           <w:b/>
           <w:bCs/>
           <w:sz w:val="20"/>
@@ -689,6 +724,7 @@
       </w:pPr>
       <w:r>
         <w:rPr>
+          <w:rFonts w:ascii="Lora Medium" w:hAnsi="Lora Medium" w:cs="Lora Medium"/>
           <w:sz w:val="22"/>
           <w:szCs w:val="22"/>
         </w:rPr>
@@ -703,6 +739,7 @@
       </w:pPr>
       <w:r>
         <w:rPr>
+          <w:rFonts w:ascii="Lora Medium" w:hAnsi="Lora Medium" w:cs="Lora Medium"/>
           <w:sz w:val="22"/>
           <w:szCs w:val="22"/>
         </w:rPr>
@@ -717,6 +754,7 @@
       </w:pPr>
       <w:r>
         <w:rPr>
+          <w:rFonts w:ascii="Lora Medium" w:hAnsi="Lora Medium" w:cs="Lora Medium"/>
           <w:sz w:val="22"/>
           <w:szCs w:val="22"/>
         </w:rPr>
@@ -731,6 +769,7 @@
       </w:pPr>
       <w:r>
         <w:rPr>
+          <w:rFonts w:ascii="Lora Medium" w:hAnsi="Lora Medium" w:cs="Lora Medium"/>
           <w:sz w:val="22"/>
           <w:szCs w:val="22"/>
         </w:rPr>
@@ -739,12 +778,15 @@
     </w:p>
     <w:p>
       <w:pPr>
+        <w:tabs>
+          <w:tab w:val="left" w:pos="8500"/>
+        </w:tabs>
         <w:spacing w:before="0" w:after="0" w:line="240" w:lineRule="auto"/>
         <w:ind w:left="1250"/>
       </w:pPr>
       <w:r>
         <w:rPr>
-          <w:rFonts w:ascii="Arial" w:hAnsi="Arial" w:cs="Arial"/>
+          <w:rFonts w:ascii="Lora" w:hAnsi="Lora" w:cs="Lora"/>
           <w:b/>
           <w:bCs/>
           <w:sz w:val="22"/>
@@ -754,13 +796,12 @@
       </w:r>
       <w:r>
         <w:rPr>
-          <w:rFonts w:ascii="Arial" w:hAnsi="Arial" w:cs="Arial"/>
+          <w:rFonts w:ascii="Lora" w:hAnsi="Lora"/>
           <w:b/>
-          <w:bCs/>
-          <w:sz w:val="18"/>
-          <w:szCs w:val="18"/>
-        </w:rPr>
-        <w:t xml:space="preserve">__________________________________________________________________________</w:t>
+          <w:sz w:val="22"/>
+          <w:u w:val="single"/>
+        </w:rPr>
+        <w:tab/>
       </w:r>
     </w:p>
     <w:sectPr>

</xml_diff>